<commit_message>
feat: add SelfIntro step, courses in education, fix photo sync
- New SelfIntro step (step 6) with writing tips card
- Education: optional courses module (name + grade, toggle)
- Experience: field order org→school/dept→name; school field added
- StepCard: "← 返回" → "← 上一步" in bottom nav
- Review: updated step index/labels, added SelfIntro section
- photo-tool: always write localStorage before redirect (fixes club template photo sync)
- docxGenerator: added coursesText and organizationFull to template data
- Templates: rebuilt with coursesText, organizationFull, photo placeholders

Co-Authored-By: Claude Sonnet 4.6 <noreply@anthropic.com>
</commit_message>
<xml_diff>
--- a/templates/club-apply.docx
+++ b/templates/club-apply.docx
@@ -4,490 +4,495 @@
   <w:body>
     <w:tbl>
       <w:tblPr>
+        <w:tblStyle w:val="TableGrid"/>
         <w:tblW w:type="auto" w:w="0"/>
+        <w:jc w:val="center"/>
         <w:tblLook w:firstColumn="1" w:firstRow="1" w:lastColumn="0" w:lastRow="0" w:noHBand="0" w:noVBand="1" w:val="04A0"/>
-        <w:tblBorders>
-          <w:top w:val="none"/>
-          <w:left w:val="none"/>
-          <w:bottom w:val="none"/>
-          <w:right w:val="none"/>
-          <w:insideH w:val="none"/>
-          <w:insideV w:val="none"/>
-        </w:tblBorders>
       </w:tblPr>
       <w:tblGrid>
-        <w:gridCol w:w="2721"/>
-        <w:gridCol w:w="9185"/>
+        <w:gridCol w:w="1984"/>
+        <w:gridCol w:w="7370"/>
       </w:tblGrid>
       <w:tr>
         <w:tc>
           <w:tcPr>
-            <w:tcW w:w="2721" w:type="dxa"/>
+            <w:tcW w:type="dxa" w:w="5128"/>
             <w:tcBorders>
               <w:top w:val="none"/>
+            </w:tcBorders>
+            <w:tcBorders>
+              <w:bottom w:val="none"/>
+            </w:tcBorders>
+            <w:tcBorders>
               <w:left w:val="none"/>
-              <w:bottom w:val="none"/>
+            </w:tcBorders>
+            <w:tcBorders>
               <w:right w:val="none"/>
             </w:tcBorders>
-            <w:shd w:val="clear" w:color="auto" w:fill="F1FAF3"/>
+            <w:vAlign w:val="center"/>
+            <w:shd w:val="clear" w:color="auto" w:fill="E8F5E9"/>
           </w:tcPr>
+          <w:p/>
           <w:p>
             <w:pPr>
-              <w:spacing w:before="360" w:after="120"/>
               <w:jc w:val="center"/>
             </w:pPr>
             <w:r>
               <w:rPr>
-                <w:sz w:val="18"/>
+                <w:sz w:val="2"/>
               </w:rPr>
               <w:t>{%photo}</w:t>
             </w:r>
           </w:p>
+        </w:tc>
+        <w:tc>
+          <w:tcPr>
+            <w:tcW w:type="dxa" w:w="5128"/>
+            <w:tcBorders>
+              <w:top w:val="none"/>
+            </w:tcBorders>
+            <w:tcBorders>
+              <w:bottom w:val="none"/>
+            </w:tcBorders>
+            <w:tcBorders>
+              <w:left w:val="none"/>
+            </w:tcBorders>
+            <w:tcBorders>
+              <w:right w:val="none"/>
+            </w:tcBorders>
+            <w:shd w:val="clear" w:color="auto" w:fill="E8F5E9"/>
+          </w:tcPr>
+          <w:p/>
           <w:p>
             <w:pPr>
-              <w:spacing w:after="40"/>
-              <w:jc w:val="center"/>
+              <w:spacing w:before="160" w:after="80"/>
             </w:pPr>
             <w:r>
               <w:rPr>
                 <w:b/>
-                <w:color w:val="222233"/>
-                <w:sz w:val="24"/>
+                <w:color w:val="2E7D32"/>
+                <w:sz w:val="40"/>
               </w:rPr>
               <w:t>{name}</w:t>
             </w:r>
           </w:p>
           <w:p>
             <w:pPr>
-              <w:spacing w:after="20"/>
-              <w:jc w:val="center"/>
+              <w:spacing w:after="40"/>
             </w:pPr>
             <w:r>
               <w:rPr>
-                <w:color w:val="888888"/>
-                <w:sz w:val="16"/>
+                <w:color w:val="555555"/>
+                <w:sz w:val="20"/>
               </w:rPr>
-              <w:t>📱 {phone}</w:t>
+              <w:t>申请部门：{expectedPosition}</w:t>
             </w:r>
           </w:p>
           <w:p>
             <w:pPr>
-              <w:spacing w:after="20"/>
-              <w:jc w:val="center"/>
+              <w:spacing w:after="40"/>
             </w:pPr>
             <w:r>
               <w:rPr>
-                <w:color w:val="888888"/>
-                <w:sz w:val="16"/>
-              </w:rPr>
-              <w:t>✉ {email}</w:t>
-            </w:r>
-          </w:p>
-          <w:p>
-            <w:pPr>
-              <w:spacing w:after="20"/>
-              <w:jc w:val="center"/>
-            </w:pPr>
-            <w:r>
-              <w:rPr>
-                <w:color w:val="888888"/>
-                <w:sz w:val="16"/>
-              </w:rPr>
-              <w:t>📍 {city}</w:t>
-            </w:r>
-          </w:p>
-          <w:p>
-            <w:pPr>
-              <w:spacing w:before="160" w:after="20"/>
-              <w:ind w:left="227"/>
-            </w:pPr>
-            <w:r>
-              <w:rPr>
-                <w:b/>
-                <w:color w:val="4CAF50"/>
-                <w:sz w:val="16"/>
-              </w:rPr>
-              <w:t>申请职位</w:t>
-            </w:r>
-          </w:p>
-          <w:p>
-            <w:pPr>
-              <w:spacing w:after="40" w:before="0"/>
-              <w:ind w:left="227"/>
-            </w:pPr>
-            <w:r>
-              <w:rPr>
-                <w:b w:val="0"/>
-                <w:color w:val="222233"/>
+                <w:color w:val="555555"/>
                 <w:sz w:val="18"/>
               </w:rPr>
-              <w:t>{expectedPosition}</w:t>
-            </w:r>
-          </w:p>
-          <w:p>
-            <w:pPr>
-              <w:spacing w:before="160" w:after="20"/>
-              <w:ind w:left="227"/>
-            </w:pPr>
-            <w:r>
-              <w:rPr>
-                <w:b/>
-                <w:color w:val="4CAF50"/>
-                <w:sz w:val="16"/>
-              </w:rPr>
-              <w:t>政治面貌</w:t>
-            </w:r>
-          </w:p>
-          <w:p>
-            <w:pPr>
-              <w:spacing w:after="40" w:before="0"/>
-              <w:ind w:left="227"/>
-            </w:pPr>
-            <w:r>
-              <w:rPr>
-                <w:b w:val="0"/>
-                <w:color w:val="222233"/>
-                <w:sz w:val="18"/>
-              </w:rPr>
-              <w:t>{politicalStatus}</w:t>
-            </w:r>
-          </w:p>
-          <w:p>
-            <w:pPr>
-              <w:spacing w:before="160" w:after="20"/>
-              <w:ind w:left="227"/>
-            </w:pPr>
-            <w:r>
-              <w:rPr>
-                <w:b/>
-                <w:color w:val="4CAF50"/>
-                <w:sz w:val="16"/>
-              </w:rPr>
-              <w:t>出生年月</w:t>
-            </w:r>
-          </w:p>
-          <w:p>
-            <w:pPr>
-              <w:spacing w:after="40" w:before="0"/>
-              <w:ind w:left="227"/>
-            </w:pPr>
-            <w:r>
-              <w:rPr>
-                <w:b w:val="0"/>
-                <w:color w:val="222233"/>
-                <w:sz w:val="18"/>
-              </w:rPr>
-              <w:t>{birthdate}</w:t>
-            </w:r>
-          </w:p>
-          <w:p>
-            <w:pPr>
-              <w:spacing w:before="160" w:after="20"/>
-              <w:ind w:left="227"/>
-            </w:pPr>
-            <w:r>
-              <w:rPr>
-                <w:b/>
-                <w:color w:val="4CAF50"/>
-                <w:sz w:val="16"/>
-              </w:rPr>
-              <w:t>专业技能</w:t>
-            </w:r>
-          </w:p>
-          <w:p>
-            <w:pPr>
-              <w:spacing w:after="40" w:before="0"/>
-              <w:ind w:left="227"/>
-            </w:pPr>
-            <w:r>
-              <w:rPr>
-                <w:b w:val="0"/>
-                <w:color w:val="888888"/>
-                <w:sz w:val="16"/>
-              </w:rPr>
-              <w:t>{computerSkills}</w:t>
-            </w:r>
-          </w:p>
-          <w:p>
-            <w:pPr>
-              <w:spacing w:before="160" w:after="20"/>
-              <w:ind w:left="227"/>
-            </w:pPr>
-            <w:r>
-              <w:rPr>
-                <w:b/>
-                <w:color w:val="4CAF50"/>
-                <w:sz w:val="16"/>
-              </w:rPr>
-              <w:t>语言能力</w:t>
-            </w:r>
-          </w:p>
-          <w:p>
-            <w:pPr>
-              <w:spacing w:after="40" w:before="0"/>
-              <w:ind w:left="227"/>
-            </w:pPr>
-            <w:r>
-              <w:rPr>
-                <w:b w:val="0"/>
-                <w:color w:val="888888"/>
-                <w:sz w:val="16"/>
-              </w:rPr>
-              <w:t>{languages}</w:t>
-            </w:r>
-          </w:p>
-          <w:p>
-            <w:pPr>
-              <w:spacing w:before="160" w:after="20"/>
-              <w:ind w:left="227"/>
-            </w:pPr>
-            <w:r>
-              <w:rPr>
-                <w:b/>
-                <w:color w:val="4CAF50"/>
-                <w:sz w:val="16"/>
-              </w:rPr>
-              <w:t>兴趣爱好</w:t>
-            </w:r>
-          </w:p>
-          <w:p>
-            <w:pPr>
-              <w:spacing w:after="40" w:before="0"/>
-              <w:ind w:left="227"/>
-            </w:pPr>
-            <w:r>
-              <w:rPr>
-                <w:b w:val="0"/>
-                <w:color w:val="888888"/>
-                <w:sz w:val="16"/>
-              </w:rPr>
-              <w:t>{hobbies}</w:t>
-            </w:r>
-          </w:p>
-        </w:tc>
-        <w:tc>
-          <w:tcPr>
-            <w:tcW w:w="9185" w:type="dxa"/>
-            <w:tcBorders>
-              <w:top w:val="none"/>
-              <w:left w:val="none"/>
-              <w:bottom w:val="none"/>
-              <w:right w:val="none"/>
-            </w:tcBorders>
-          </w:tcPr>
-          <w:p>
-            <w:pPr>
-              <w:spacing w:before="360"/>
-            </w:pPr>
-          </w:p>
-          <w:p>
-            <w:pPr>
-              <w:spacing w:before="240" w:after="60"/>
-              <w:ind w:left="340" w:right="454"/>
-              <w:pBdr>
-                <w:bottom w:val="single" w:sz="4" w:space="1" w:color="4CAF50"/>
-              </w:pBdr>
-            </w:pPr>
-            <w:r>
-              <w:rPr>
-                <w:b/>
-                <w:color w:val="4CAF50"/>
-                <w:sz w:val="22"/>
-              </w:rPr>
-              <w:t>教育背景</w:t>
-            </w:r>
-          </w:p>
-          <w:p>
-            <w:pPr>
-              <w:ind w:left="340" w:right="454"/>
-            </w:pPr>
-            <w:r>
-              <w:rPr>
-                <w:b/>
-                <w:sz w:val="20"/>
-              </w:rPr>
-              <w:t>{school}</w:t>
-            </w:r>
-            <w:r>
-              <w:rPr>
-                <w:color w:val="888888"/>
-                <w:sz w:val="18"/>
-              </w:rPr>
-              <w:t xml:space="preserve">  ·  {major}（{degree}）</w:t>
-            </w:r>
-            <w:r>
-              <w:rPr>
-                <w:color w:val="888888"/>
-                <w:sz w:val="18"/>
-              </w:rPr>
-              <w:t xml:space="preserve">  {eduDates}</w:t>
-            </w:r>
-          </w:p>
-          <w:p>
-            <w:pPr>
-              <w:ind w:left="340" w:right="454"/>
-            </w:pPr>
-            <w:r>
-              <w:rPr>
-                <w:color w:val="888888"/>
-                <w:sz w:val="18"/>
-              </w:rPr>
-              <w:t>GPA：{gpa}   排名：{rank}</w:t>
-            </w:r>
-          </w:p>
-          <w:p>
-            <w:pPr>
-              <w:spacing w:before="240" w:after="60"/>
-              <w:ind w:left="340" w:right="454"/>
-              <w:pBdr>
-                <w:bottom w:val="single" w:sz="4" w:space="1" w:color="4CAF50"/>
-              </w:pBdr>
-            </w:pPr>
-            <w:r>
-              <w:rPr>
-                <w:b/>
-                <w:color w:val="4CAF50"/>
-                <w:sz w:val="22"/>
-              </w:rPr>
-              <w:t>活动 / 经历</w:t>
-            </w:r>
-          </w:p>
-          <w:p>
-            <w:pPr>
-              <w:spacing w:after="0"/>
-              <w:ind w:left="340" w:right="454"/>
-            </w:pPr>
-            <w:r>
-              <w:t>{#experiences}</w:t>
-            </w:r>
-          </w:p>
-          <w:p>
-            <w:pPr>
-              <w:ind w:left="340" w:right="454"/>
-            </w:pPr>
-            <w:r>
-              <w:rPr>
-                <w:b/>
-                <w:sz w:val="20"/>
-              </w:rPr>
-              <w:t>{name}</w:t>
-            </w:r>
-            <w:r>
-              <w:rPr>
-                <w:color w:val="888888"/>
-                <w:sz w:val="18"/>
-              </w:rPr>
-              <w:t xml:space="preserve">  ·  {organization}   {dates}</w:t>
-            </w:r>
-          </w:p>
-          <w:p>
-            <w:pPr>
-              <w:spacing w:after="80"/>
-              <w:ind w:left="340" w:right="454"/>
-            </w:pPr>
-            <w:r>
-              <w:rPr>
-                <w:sz w:val="18"/>
-              </w:rPr>
-              <w:t>{bulletsText}</w:t>
-            </w:r>
-          </w:p>
-          <w:p>
-            <w:pPr>
-              <w:spacing w:after="0"/>
-              <w:ind w:left="340" w:right="454"/>
-            </w:pPr>
-            <w:r>
-              <w:t>{/experiences}</w:t>
-            </w:r>
-          </w:p>
-          <w:p>
-            <w:pPr>
-              <w:spacing w:before="240" w:after="60"/>
-              <w:ind w:left="340" w:right="454"/>
-              <w:pBdr>
-                <w:bottom w:val="single" w:sz="4" w:space="1" w:color="4CAF50"/>
-              </w:pBdr>
-            </w:pPr>
-            <w:r>
-              <w:rPr>
-                <w:b/>
-                <w:color w:val="4CAF50"/>
-                <w:sz w:val="22"/>
-              </w:rPr>
-              <w:t>获奖荣誉</w:t>
-            </w:r>
-          </w:p>
-          <w:p>
-            <w:pPr>
-              <w:spacing w:after="0"/>
-              <w:ind w:left="340" w:right="454"/>
-            </w:pPr>
-            <w:r>
-              <w:t>{#awards}</w:t>
-            </w:r>
-          </w:p>
-          <w:p>
-            <w:pPr>
-              <w:ind w:left="340" w:right="454"/>
-            </w:pPr>
-            <w:r>
-              <w:rPr>
-                <w:sz w:val="18"/>
-              </w:rPr>
-              <w:t>{levelAndName}</w:t>
-            </w:r>
-            <w:r>
-              <w:rPr>
-                <w:color w:val="888888"/>
-                <w:sz w:val="18"/>
-              </w:rPr>
-              <w:t xml:space="preserve">  {date}</w:t>
-            </w:r>
-          </w:p>
-          <w:p>
-            <w:pPr>
-              <w:spacing w:after="0"/>
-              <w:ind w:left="340" w:right="454"/>
-            </w:pPr>
-            <w:r>
-              <w:t>{/awards}</w:t>
-            </w:r>
-          </w:p>
-          <w:p>
-            <w:pPr>
-              <w:spacing w:before="240" w:after="60"/>
-              <w:ind w:left="340" w:right="454"/>
-              <w:pBdr>
-                <w:bottom w:val="single" w:sz="4" w:space="1" w:color="4CAF50"/>
-              </w:pBdr>
-            </w:pPr>
-            <w:r>
-              <w:rPr>
-                <w:b/>
-                <w:color w:val="4CAF50"/>
-                <w:sz w:val="22"/>
-              </w:rPr>
-              <w:t>自我介绍</w:t>
-            </w:r>
-          </w:p>
-          <w:p>
-            <w:pPr>
-              <w:ind w:left="340" w:right="454"/>
-            </w:pPr>
-            <w:r>
-              <w:rPr>
-                <w:sz w:val="18"/>
-              </w:rPr>
-              <w:t>{selfIntro}</w:t>
+              <w:t>{phone}　|　{email}　|　{city}　|　{politicalStatus}</w:t>
             </w:r>
           </w:p>
         </w:tc>
       </w:tr>
     </w:tbl>
+    <w:p>
+      <w:pPr>
+        <w:spacing w:before="40" w:after="120"/>
+        <w:pBdr>
+          <w:bottom w:val="single" w:sz="6" w:space="1" w:color="CCCCCC"/>
+        </w:pBdr>
+      </w:pPr>
+    </w:p>
+    <w:p>
+      <w:pPr>
+        <w:spacing w:before="240" w:after="80"/>
+        <w:pBdr>
+          <w:bottom w:val="single" w:sz="6" w:space="1" w:color="2E7D32"/>
+        </w:pBdr>
+      </w:pPr>
+      <w:r>
+        <w:rPr>
+          <w:b/>
+          <w:color w:val="2E7D32"/>
+          <w:sz w:val="26"/>
+        </w:rPr>
+        <w:t>教育背景</w:t>
+      </w:r>
+    </w:p>
+    <w:p>
+      <w:pPr>
+        <w:spacing w:after="60"/>
+      </w:pPr>
+      <w:r>
+        <w:rPr>
+          <w:b/>
+          <w:color w:val="555555"/>
+          <w:sz w:val="20"/>
+        </w:rPr>
+        <w:t>学校：</w:t>
+      </w:r>
+      <w:r>
+        <w:rPr>
+          <w:sz w:val="20"/>
+        </w:rPr>
+        <w:t>{school}</w:t>
+      </w:r>
+    </w:p>
+    <w:p>
+      <w:pPr>
+        <w:spacing w:after="60"/>
+      </w:pPr>
+      <w:r>
+        <w:rPr>
+          <w:b/>
+          <w:color w:val="555555"/>
+          <w:sz w:val="20"/>
+        </w:rPr>
+        <w:t>专业：</w:t>
+      </w:r>
+      <w:r>
+        <w:rPr>
+          <w:sz w:val="20"/>
+        </w:rPr>
+        <w:t>{major}（{degree}）</w:t>
+      </w:r>
+    </w:p>
+    <w:p>
+      <w:pPr>
+        <w:spacing w:after="60"/>
+      </w:pPr>
+      <w:r>
+        <w:rPr>
+          <w:b/>
+          <w:color w:val="555555"/>
+          <w:sz w:val="20"/>
+        </w:rPr>
+        <w:t>时间：</w:t>
+      </w:r>
+      <w:r>
+        <w:rPr>
+          <w:sz w:val="20"/>
+        </w:rPr>
+        <w:t>{eduDates}</w:t>
+      </w:r>
+    </w:p>
+    <w:p>
+      <w:pPr>
+        <w:spacing w:after="60"/>
+      </w:pPr>
+      <w:r>
+        <w:rPr>
+          <w:b/>
+          <w:color w:val="555555"/>
+          <w:sz w:val="20"/>
+        </w:rPr>
+        <w:t>GPA：</w:t>
+      </w:r>
+      <w:r>
+        <w:rPr>
+          <w:sz w:val="20"/>
+        </w:rPr>
+        <w:t>{gpa}　专业排名：{rank}</w:t>
+      </w:r>
+    </w:p>
+    <w:p>
+      <w:pPr>
+        <w:spacing w:after="60"/>
+      </w:pPr>
+      <w:r>
+        <w:rPr>
+          <w:b/>
+          <w:color w:val="555555"/>
+          <w:sz w:val="20"/>
+        </w:rPr>
+        <w:t>主修课程：</w:t>
+      </w:r>
+      <w:r>
+        <w:rPr>
+          <w:sz w:val="20"/>
+        </w:rPr>
+        <w:t>{coursesText}</w:t>
+      </w:r>
+    </w:p>
+    <w:p>
+      <w:pPr>
+        <w:spacing w:before="40" w:after="120"/>
+        <w:pBdr>
+          <w:bottom w:val="single" w:sz="6" w:space="1" w:color="CCCCCC"/>
+        </w:pBdr>
+      </w:pPr>
+    </w:p>
+    <w:p>
+      <w:pPr>
+        <w:spacing w:before="240" w:after="80"/>
+        <w:pBdr>
+          <w:bottom w:val="single" w:sz="6" w:space="1" w:color="2E7D32"/>
+        </w:pBdr>
+      </w:pPr>
+      <w:r>
+        <w:rPr>
+          <w:b/>
+          <w:color w:val="2E7D32"/>
+          <w:sz w:val="26"/>
+        </w:rPr>
+        <w:t>参与经历</w:t>
+      </w:r>
+    </w:p>
+    <w:p>
+      <w:pPr>
+        <w:spacing w:before="0" w:after="60"/>
+      </w:pPr>
+      <w:r>
+        <w:rPr>
+          <w:b w:val="0"/>
+          <w:color w:val="FFFFFF"/>
+          <w:sz w:val="2"/>
+        </w:rPr>
+        <w:t>{#experiences}</w:t>
+      </w:r>
+    </w:p>
+    <w:p>
+      <w:pPr>
+        <w:spacing w:before="140" w:after="40"/>
+      </w:pPr>
+      <w:r>
+        <w:rPr>
+          <w:b/>
+          <w:sz w:val="22"/>
+        </w:rPr>
+        <w:t>{name}</w:t>
+      </w:r>
+      <w:r>
+        <w:rPr>
+          <w:color w:val="888888"/>
+          <w:sz w:val="20"/>
+        </w:rPr>
+        <w:t xml:space="preserve">  ·  {organizationFull}  {dates}</w:t>
+      </w:r>
+    </w:p>
+    <w:p>
+      <w:pPr>
+        <w:spacing w:before="0" w:after="60"/>
+      </w:pPr>
+      <w:r>
+        <w:rPr>
+          <w:b w:val="0"/>
+          <w:sz w:val="20"/>
+        </w:rPr>
+        <w:t>{bulletsText}</w:t>
+      </w:r>
+    </w:p>
+    <w:p>
+      <w:pPr>
+        <w:spacing w:before="0" w:after="60"/>
+      </w:pPr>
+      <w:r>
+        <w:rPr>
+          <w:b w:val="0"/>
+          <w:color w:val="FFFFFF"/>
+          <w:sz w:val="2"/>
+        </w:rPr>
+        <w:t>{/experiences}</w:t>
+      </w:r>
+    </w:p>
+    <w:p>
+      <w:pPr>
+        <w:spacing w:before="40" w:after="120"/>
+        <w:pBdr>
+          <w:bottom w:val="single" w:sz="6" w:space="1" w:color="CCCCCC"/>
+        </w:pBdr>
+      </w:pPr>
+    </w:p>
+    <w:p>
+      <w:pPr>
+        <w:spacing w:before="240" w:after="80"/>
+        <w:pBdr>
+          <w:bottom w:val="single" w:sz="6" w:space="1" w:color="2E7D32"/>
+        </w:pBdr>
+      </w:pPr>
+      <w:r>
+        <w:rPr>
+          <w:b/>
+          <w:color w:val="2E7D32"/>
+          <w:sz w:val="26"/>
+        </w:rPr>
+        <w:t>获奖荣誉</w:t>
+      </w:r>
+    </w:p>
+    <w:p>
+      <w:pPr>
+        <w:spacing w:before="0" w:after="60"/>
+      </w:pPr>
+      <w:r>
+        <w:rPr>
+          <w:b w:val="0"/>
+          <w:color w:val="FFFFFF"/>
+          <w:sz w:val="2"/>
+        </w:rPr>
+        <w:t>{#awards}</w:t>
+      </w:r>
+    </w:p>
+    <w:p>
+      <w:pPr>
+        <w:pStyle w:val="ListBullet"/>
+        <w:spacing w:after="80"/>
+      </w:pPr>
+      <w:r>
+        <w:rPr>
+          <w:b/>
+          <w:sz w:val="20"/>
+        </w:rPr>
+        <w:t>{levelAndName}</w:t>
+      </w:r>
+      <w:r>
+        <w:rPr>
+          <w:color w:val="888888"/>
+          <w:sz w:val="20"/>
+        </w:rPr>
+        <w:t xml:space="preserve">　{date}</w:t>
+      </w:r>
+    </w:p>
+    <w:p>
+      <w:pPr>
+        <w:spacing w:before="0" w:after="60"/>
+      </w:pPr>
+      <w:r>
+        <w:rPr>
+          <w:b w:val="0"/>
+          <w:color w:val="FFFFFF"/>
+          <w:sz w:val="2"/>
+        </w:rPr>
+        <w:t>{/awards}</w:t>
+      </w:r>
+    </w:p>
+    <w:p>
+      <w:pPr>
+        <w:spacing w:before="40" w:after="120"/>
+        <w:pBdr>
+          <w:bottom w:val="single" w:sz="6" w:space="1" w:color="CCCCCC"/>
+        </w:pBdr>
+      </w:pPr>
+    </w:p>
+    <w:p>
+      <w:pPr>
+        <w:spacing w:before="240" w:after="80"/>
+        <w:pBdr>
+          <w:bottom w:val="single" w:sz="6" w:space="1" w:color="2E7D32"/>
+        </w:pBdr>
+      </w:pPr>
+      <w:r>
+        <w:rPr>
+          <w:b/>
+          <w:color w:val="2E7D32"/>
+          <w:sz w:val="26"/>
+        </w:rPr>
+        <w:t>技能特长</w:t>
+      </w:r>
+    </w:p>
+    <w:p>
+      <w:pPr>
+        <w:spacing w:after="60"/>
+      </w:pPr>
+      <w:r>
+        <w:rPr>
+          <w:b/>
+          <w:color w:val="555555"/>
+          <w:sz w:val="20"/>
+        </w:rPr>
+        <w:t>语言能力：</w:t>
+      </w:r>
+      <w:r>
+        <w:rPr>
+          <w:sz w:val="20"/>
+        </w:rPr>
+        <w:t>{languages}</w:t>
+      </w:r>
+    </w:p>
+    <w:p>
+      <w:pPr>
+        <w:spacing w:after="60"/>
+      </w:pPr>
+      <w:r>
+        <w:rPr>
+          <w:b/>
+          <w:color w:val="555555"/>
+          <w:sz w:val="20"/>
+        </w:rPr>
+        <w:t>专业技能：</w:t>
+      </w:r>
+      <w:r>
+        <w:rPr>
+          <w:sz w:val="20"/>
+        </w:rPr>
+        <w:t>{computerSkills}</w:t>
+      </w:r>
+    </w:p>
+    <w:p>
+      <w:pPr>
+        <w:spacing w:after="60"/>
+      </w:pPr>
+      <w:r>
+        <w:rPr>
+          <w:b/>
+          <w:color w:val="555555"/>
+          <w:sz w:val="20"/>
+        </w:rPr>
+        <w:t>兴趣爱好：</w:t>
+      </w:r>
+      <w:r>
+        <w:rPr>
+          <w:sz w:val="20"/>
+        </w:rPr>
+        <w:t>{hobbies}</w:t>
+      </w:r>
+    </w:p>
+    <w:p>
+      <w:pPr>
+        <w:spacing w:before="40" w:after="120"/>
+        <w:pBdr>
+          <w:bottom w:val="single" w:sz="6" w:space="1" w:color="CCCCCC"/>
+        </w:pBdr>
+      </w:pPr>
+    </w:p>
+    <w:p>
+      <w:pPr>
+        <w:spacing w:before="240" w:after="80"/>
+        <w:pBdr>
+          <w:bottom w:val="single" w:sz="6" w:space="1" w:color="2E7D32"/>
+        </w:pBdr>
+      </w:pPr>
+      <w:r>
+        <w:rPr>
+          <w:b/>
+          <w:color w:val="2E7D32"/>
+          <w:sz w:val="26"/>
+        </w:rPr>
+        <w:t>自我评价</w:t>
+      </w:r>
+    </w:p>
+    <w:p>
+      <w:pPr>
+        <w:spacing w:before="0" w:after="60"/>
+      </w:pPr>
+      <w:r>
+        <w:rPr>
+          <w:b w:val="0"/>
+          <w:sz w:val="20"/>
+        </w:rPr>
+        <w:t>{selfIntro}</w:t>
+      </w:r>
+    </w:p>
     <w:sectPr>
       <w:pgSz w:w="12240" w:h="15840"/>
-      <w:pgMar w:top="0" w:right="0" w:bottom="1134" w:left="0" w:header="720" w:footer="720" w:gutter="0"/>
+      <w:pgMar w:top="850" w:right="1134" w:bottom="1134" w:left="850" w:header="720" w:footer="720" w:gutter="0"/>
       <w:cols w:space="720"/>
       <w:docGrid w:linePitch="360"/>
     </w:sectPr>

</xml_diff>

<commit_message>
fix: club template photo to right, merge experience org+dept fields
- club-apply.docx: swap columns — info on left, photo on right
- Experience.jsx: merge 机构/公司名称 + 学校/部门 into one field
  labeled 机构名称, hint guides user to include 学校部门 in one input
- docxGenerator: organizationFull = organization (single merged field)
- Experience: update card styling to use CSS variables

Co-Authored-By: Claude Sonnet 4.6 <noreply@anthropic.com>
</commit_message>
<xml_diff>
--- a/templates/club-apply.docx
+++ b/templates/club-apply.docx
@@ -10,37 +10,10 @@
         <w:tblLook w:firstColumn="1" w:firstRow="1" w:lastColumn="0" w:lastRow="0" w:noHBand="0" w:noVBand="1" w:val="04A0"/>
       </w:tblPr>
       <w:tblGrid>
+        <w:gridCol w:w="7654"/>
         <w:gridCol w:w="1701"/>
-        <w:gridCol w:w="7654"/>
       </w:tblGrid>
       <w:tr>
-        <w:tc>
-          <w:tcPr>
-            <w:tcW w:type="dxa" w:w="5100"/>
-            <w:tcBorders>
-              <w:top w:val="none"/>
-              <w:left w:val="none"/>
-              <w:bottom w:val="none"/>
-              <w:right w:val="none"/>
-              <w:insideH w:val="none"/>
-              <w:insideV w:val="none"/>
-            </w:tcBorders>
-            <w:shd w:val="clear" w:color="auto" w:fill="E8F5E9"/>
-            <w:vAlign w:val="center"/>
-          </w:tcPr>
-          <w:p/>
-          <w:p>
-            <w:pPr>
-              <w:jc w:val="center"/>
-            </w:pPr>
-            <w:r>
-              <w:rPr>
-                <w:sz w:val="2"/>
-              </w:rPr>
-              <w:t>{%photo}</w:t>
-            </w:r>
-          </w:p>
-        </w:tc>
         <w:tc>
           <w:tcPr>
             <w:tcW w:type="dxa" w:w="5100"/>
@@ -93,6 +66,33 @@
                 <w:sz w:val="18"/>
               </w:rPr>
               <w:t>{phone}  ·  {email}  ·  {city}  ·  {politicalStatus}</w:t>
+            </w:r>
+          </w:p>
+        </w:tc>
+        <w:tc>
+          <w:tcPr>
+            <w:tcW w:type="dxa" w:w="5100"/>
+            <w:tcBorders>
+              <w:top w:val="none"/>
+              <w:left w:val="none"/>
+              <w:bottom w:val="none"/>
+              <w:right w:val="none"/>
+              <w:insideH w:val="none"/>
+              <w:insideV w:val="none"/>
+            </w:tcBorders>
+            <w:shd w:val="clear" w:color="auto" w:fill="E8F5E9"/>
+            <w:vAlign w:val="center"/>
+          </w:tcPr>
+          <w:p/>
+          <w:p>
+            <w:pPr>
+              <w:jc w:val="center"/>
+            </w:pPr>
+            <w:r>
+              <w:rPr>
+                <w:sz w:val="2"/>
+              </w:rPr>
+              <w:t>{%photo}</w:t>
             </w:r>
           </w:p>
         </w:tc>

</xml_diff>